<commit_message>
Redesign Company Profile page with stats, services grid and why choose section
Co-authored-by: fullstackwebdeveloper1000-coder <fullstackwebdeveloper1000-coder@users.noreply.github.com>
</commit_message>
<xml_diff>
--- a/CoLab_Space_Point_Proposal_Photos.docx
+++ b/CoLab_Space_Point_Proposal_Photos.docx
@@ -170,12 +170,57 @@
     <w:tbl>
       <w:tblPr>
         <w:tblW w:type="auto" w:w="0"/>
-        <w:jc w:val="left"/>
         <w:tblLook w:firstColumn="1" w:firstRow="1" w:lastColumn="0" w:lastRow="0" w:noHBand="0" w:noVBand="1" w:val="04A0"/>
       </w:tblPr>
       <w:tblGrid>
-        <w:gridCol w:w="907"/>
-        <w:gridCol w:w="8504"/>
+        <w:gridCol w:w="9746"/>
+      </w:tblGrid>
+      <w:tr>
+        <w:tc>
+          <w:tcPr>
+            <w:tcW w:type="dxa" w:w="9746"/>
+            <w:shd w:val="clear" w:fill="04243C"/>
+          </w:tcPr>
+          <w:p>
+            <w:pPr>
+              <w:jc w:val="center"/>
+            </w:pPr>
+            <w:r>
+              <w:rPr>
+                <w:rFonts w:ascii="Arial" w:hAnsi="Arial"/>
+                <w:b/>
+                <w:color w:val="FFFFFF"/>
+                <w:sz w:val="40"/>
+              </w:rPr>
+              <w:t>COMPANY PROFILE</w:t>
+            </w:r>
+          </w:p>
+          <w:p>
+            <w:pPr>
+              <w:jc w:val="center"/>
+            </w:pPr>
+            <w:r>
+              <w:rPr>
+                <w:rFonts w:ascii="Arial" w:hAnsi="Arial"/>
+                <w:b w:val="0"/>
+                <w:color w:val="06ACBA"/>
+                <w:sz w:val="22"/>
+              </w:rPr>
+              <w:t>CoLab Space Point  |  Digital Agency  |  Gujrat</w:t>
+            </w:r>
+          </w:p>
+        </w:tc>
+      </w:tr>
+    </w:tbl>
+    <w:p/>
+    <w:tbl>
+      <w:tblPr>
+        <w:tblW w:type="auto" w:w="0"/>
+        <w:tblLook w:firstColumn="1" w:firstRow="1" w:lastColumn="0" w:lastRow="0" w:noHBand="0" w:noVBand="1" w:val="04A0"/>
+      </w:tblPr>
+      <w:tblGrid>
+        <w:gridCol w:w="1247"/>
+        <w:gridCol w:w="7937"/>
       </w:tblGrid>
       <w:tr>
         <w:tc>
@@ -189,7 +234,7 @@
             <w:r>
               <w:drawing>
                 <wp:inline xmlns:a="http://schemas.openxmlformats.org/drawingml/2006/main" xmlns:pic="http://schemas.openxmlformats.org/drawingml/2006/picture">
-                  <wp:extent cx="502920" cy="502920"/>
+                  <wp:extent cx="822960" cy="198882"/>
                   <wp:docPr id="2" name="Picture 2"/>
                   <wp:cNvGraphicFramePr>
                     <a:graphicFrameLocks noChangeAspect="1"/>
@@ -198,11 +243,11 @@
                     <a:graphicData uri="http://schemas.openxmlformats.org/drawingml/2006/picture">
                       <pic:pic>
                         <pic:nvPicPr>
-                          <pic:cNvPr id="0" name="company.png"/>
+                          <pic:cNvPr id="0" name="logo.png"/>
                           <pic:cNvPicPr/>
                         </pic:nvPicPr>
                         <pic:blipFill>
-                          <a:blip r:embed="rId10"/>
+                          <a:blip r:embed="rId9"/>
                           <a:stretch>
                             <a:fillRect/>
                           </a:stretch>
@@ -210,7 +255,7 @@
                         <pic:spPr>
                           <a:xfrm>
                             <a:off x="0" y="0"/>
-                            <a:ext cx="502920" cy="502920"/>
+                            <a:ext cx="822960" cy="198882"/>
                           </a:xfrm>
                           <a:prstGeom prst="rect"/>
                         </pic:spPr>
@@ -225,16 +270,17 @@
         <w:tc>
           <w:tcPr>
             <w:tcW w:type="dxa" w:w="4873"/>
+            <w:shd w:val="clear" w:fill="E8F7F9"/>
           </w:tcPr>
           <w:p>
             <w:r>
               <w:rPr>
                 <w:rFonts w:ascii="Arial" w:hAnsi="Arial"/>
                 <w:b/>
-                <w:color w:val="000000"/>
-                <w:sz w:val="36"/>
+                <w:color w:val="04243C"/>
+                <w:sz w:val="28"/>
               </w:rPr>
-              <w:t>Company Profile</w:t>
+              <w:t>About Us</w:t>
             </w:r>
           </w:p>
           <w:p>
@@ -242,10 +288,508 @@
               <w:rPr>
                 <w:rFonts w:ascii="Arial" w:hAnsi="Arial"/>
                 <w:b w:val="0"/>
-                <w:color w:val="04243C"/>
+                <w:color w:val="000000"/>
                 <w:sz w:val="22"/>
               </w:rPr>
-              <w:t>Digital services from CoLab Point, Gujrat</w:t>
+              <w:t>CoLab Space Point is the digital services division of CoLab Point — a trusted innovation and coworking hub in Gujrat since 2021. We help businesses establish a strong online presence, sell through e-commerce, and acquire customers through data-driven marketing.</w:t>
+            </w:r>
+          </w:p>
+          <w:p>
+            <w:r>
+              <w:rPr>
+                <w:rFonts w:ascii="Arial" w:hAnsi="Arial"/>
+                <w:b w:val="0"/>
+                <w:color w:val="000000"/>
+                <w:sz w:val="22"/>
+              </w:rPr>
+              <w:t>Our mission is to deliver premium digital experiences that convert visitors into customers — with transparent pricing, professional delivery, and ongoing support after every launch.</w:t>
+            </w:r>
+          </w:p>
+        </w:tc>
+      </w:tr>
+    </w:tbl>
+    <w:p/>
+    <w:tbl>
+      <w:tblPr>
+        <w:tblW w:type="auto" w:w="0"/>
+        <w:jc w:val="center"/>
+        <w:tblLook w:firstColumn="1" w:firstRow="1" w:lastColumn="0" w:lastRow="0" w:noHBand="0" w:noVBand="1" w:val="04A0"/>
+      </w:tblPr>
+      <w:tblGrid>
+        <w:gridCol w:w="2436"/>
+        <w:gridCol w:w="2436"/>
+        <w:gridCol w:w="2436"/>
+        <w:gridCol w:w="2436"/>
+      </w:tblGrid>
+      <w:tr>
+        <w:tc>
+          <w:tcPr>
+            <w:tcW w:type="dxa" w:w="2436"/>
+            <w:shd w:val="clear" w:fill="06ACBA"/>
+          </w:tcPr>
+          <w:p>
+            <w:pPr>
+              <w:jc w:val="center"/>
+            </w:pPr>
+            <w:r/>
+            <w:r>
+              <w:rPr>
+                <w:rFonts w:ascii="Arial" w:hAnsi="Arial"/>
+                <w:b/>
+                <w:color w:val="FFFFFF"/>
+                <w:sz w:val="22"/>
+              </w:rPr>
+              <w:t>Est. 2021</w:t>
+            </w:r>
+          </w:p>
+        </w:tc>
+        <w:tc>
+          <w:tcPr>
+            <w:tcW w:type="dxa" w:w="2436"/>
+            <w:shd w:val="clear" w:fill="06ACBA"/>
+          </w:tcPr>
+          <w:p>
+            <w:pPr>
+              <w:jc w:val="center"/>
+            </w:pPr>
+            <w:r/>
+            <w:r>
+              <w:rPr>
+                <w:rFonts w:ascii="Arial" w:hAnsi="Arial"/>
+                <w:b/>
+                <w:color w:val="FFFFFF"/>
+                <w:sz w:val="22"/>
+              </w:rPr>
+              <w:t>Location</w:t>
+            </w:r>
+          </w:p>
+        </w:tc>
+        <w:tc>
+          <w:tcPr>
+            <w:tcW w:type="dxa" w:w="2436"/>
+            <w:shd w:val="clear" w:fill="06ACBA"/>
+          </w:tcPr>
+          <w:p>
+            <w:pPr>
+              <w:jc w:val="center"/>
+            </w:pPr>
+            <w:r/>
+            <w:r>
+              <w:rPr>
+                <w:rFonts w:ascii="Arial" w:hAnsi="Arial"/>
+                <w:b/>
+                <w:color w:val="FFFFFF"/>
+                <w:sz w:val="22"/>
+              </w:rPr>
+              <w:t>Platform</w:t>
+            </w:r>
+          </w:p>
+        </w:tc>
+        <w:tc>
+          <w:tcPr>
+            <w:tcW w:type="dxa" w:w="2436"/>
+            <w:shd w:val="clear" w:fill="06ACBA"/>
+          </w:tcPr>
+          <w:p>
+            <w:pPr>
+              <w:jc w:val="center"/>
+            </w:pPr>
+            <w:r/>
+            <w:r>
+              <w:rPr>
+                <w:rFonts w:ascii="Arial" w:hAnsi="Arial"/>
+                <w:b/>
+                <w:color w:val="FFFFFF"/>
+                <w:sz w:val="22"/>
+              </w:rPr>
+              <w:t>Focus</w:t>
+            </w:r>
+          </w:p>
+        </w:tc>
+      </w:tr>
+      <w:tr>
+        <w:tc>
+          <w:tcPr>
+            <w:tcW w:type="dxa" w:w="2436"/>
+            <w:shd w:val="clear" w:fill="F4FBFC"/>
+          </w:tcPr>
+          <w:p>
+            <w:pPr>
+              <w:jc w:val="center"/>
+            </w:pPr>
+            <w:r/>
+            <w:r>
+              <w:rPr>
+                <w:rFonts w:ascii="Arial" w:hAnsi="Arial"/>
+                <w:b w:val="0"/>
+                <w:color w:val="000000"/>
+                <w:sz w:val="20"/>
+              </w:rPr>
+              <w:t>CoLab Point ecosystem</w:t>
+            </w:r>
+          </w:p>
+        </w:tc>
+        <w:tc>
+          <w:tcPr>
+            <w:tcW w:type="dxa" w:w="2436"/>
+            <w:shd w:val="clear" w:fill="F4FBFC"/>
+          </w:tcPr>
+          <w:p>
+            <w:pPr>
+              <w:jc w:val="center"/>
+            </w:pPr>
+            <w:r/>
+            <w:r>
+              <w:rPr>
+                <w:rFonts w:ascii="Arial" w:hAnsi="Arial"/>
+                <w:b w:val="0"/>
+                <w:color w:val="000000"/>
+                <w:sz w:val="20"/>
+              </w:rPr>
+              <w:t>Gujrat, Pakistan</w:t>
+            </w:r>
+          </w:p>
+        </w:tc>
+        <w:tc>
+          <w:tcPr>
+            <w:tcW w:type="dxa" w:w="2436"/>
+            <w:shd w:val="clear" w:fill="F4FBFC"/>
+          </w:tcPr>
+          <w:p>
+            <w:pPr>
+              <w:jc w:val="center"/>
+            </w:pPr>
+            <w:r/>
+            <w:r>
+              <w:rPr>
+                <w:rFonts w:ascii="Arial" w:hAnsi="Arial"/>
+                <w:b w:val="0"/>
+                <w:color w:val="000000"/>
+                <w:sz w:val="20"/>
+              </w:rPr>
+              <w:t>WordPress &amp; WooCommerce</w:t>
+            </w:r>
+          </w:p>
+        </w:tc>
+        <w:tc>
+          <w:tcPr>
+            <w:tcW w:type="dxa" w:w="2436"/>
+            <w:shd w:val="clear" w:fill="F4FBFC"/>
+          </w:tcPr>
+          <w:p>
+            <w:pPr>
+              <w:jc w:val="center"/>
+            </w:pPr>
+            <w:r/>
+            <w:r>
+              <w:rPr>
+                <w:rFonts w:ascii="Arial" w:hAnsi="Arial"/>
+                <w:b w:val="0"/>
+                <w:color w:val="000000"/>
+                <w:sz w:val="20"/>
+              </w:rPr>
+              <w:t>Websites + Digital Marketing</w:t>
+            </w:r>
+          </w:p>
+        </w:tc>
+      </w:tr>
+    </w:tbl>
+    <w:p/>
+    <w:p>
+      <w:pPr>
+        <w:spacing w:after="160" w:before="40"/>
+      </w:pPr>
+      <w:r>
+        <w:rPr>
+          <w:rFonts w:ascii="Arial" w:hAnsi="Arial"/>
+          <w:b/>
+          <w:color w:val="04243C"/>
+          <w:sz w:val="28"/>
+        </w:rPr>
+        <w:t>Our Core Services</w:t>
+      </w:r>
+    </w:p>
+    <w:tbl>
+      <w:tblPr>
+        <w:tblW w:type="auto" w:w="0"/>
+        <w:tblLook w:firstColumn="1" w:firstRow="1" w:lastColumn="0" w:lastRow="0" w:noHBand="0" w:noVBand="1" w:val="04A0"/>
+      </w:tblPr>
+      <w:tblGrid>
+        <w:gridCol w:w="4873"/>
+        <w:gridCol w:w="4873"/>
+      </w:tblGrid>
+      <w:tr>
+        <w:tc>
+          <w:tcPr>
+            <w:tcW w:type="dxa" w:w="4873"/>
+            <w:shd w:val="clear" w:fill="FFFFFF"/>
+          </w:tcPr>
+          <w:p>
+            <w:r/>
+            <w:r>
+              <w:rPr>
+                <w:rFonts w:ascii="Arial" w:hAnsi="Arial"/>
+                <w:b w:val="0"/>
+                <w:color w:val="000000"/>
+                <w:sz w:val="22"/>
+              </w:rPr>
+              <w:t xml:space="preserve">  ✓  Website Designing &amp; Development</w:t>
+            </w:r>
+          </w:p>
+        </w:tc>
+        <w:tc>
+          <w:tcPr>
+            <w:tcW w:type="dxa" w:w="4873"/>
+            <w:shd w:val="clear" w:fill="FFFFFF"/>
+          </w:tcPr>
+          <w:p>
+            <w:r/>
+            <w:r>
+              <w:rPr>
+                <w:rFonts w:ascii="Arial" w:hAnsi="Arial"/>
+                <w:b w:val="0"/>
+                <w:color w:val="000000"/>
+                <w:sz w:val="22"/>
+              </w:rPr>
+              <w:t xml:space="preserve">  ✓  SEO (Search Engine Optimization)</w:t>
+            </w:r>
+          </w:p>
+        </w:tc>
+      </w:tr>
+      <w:tr>
+        <w:tc>
+          <w:tcPr>
+            <w:tcW w:type="dxa" w:w="4873"/>
+            <w:shd w:val="clear" w:fill="FFFFFF"/>
+          </w:tcPr>
+          <w:p>
+            <w:r/>
+            <w:r>
+              <w:rPr>
+                <w:rFonts w:ascii="Arial" w:hAnsi="Arial"/>
+                <w:b w:val="0"/>
+                <w:color w:val="000000"/>
+                <w:sz w:val="22"/>
+              </w:rPr>
+              <w:t xml:space="preserve">  ✓  WordPress Development</w:t>
+            </w:r>
+          </w:p>
+        </w:tc>
+        <w:tc>
+          <w:tcPr>
+            <w:tcW w:type="dxa" w:w="4873"/>
+            <w:shd w:val="clear" w:fill="FFFFFF"/>
+          </w:tcPr>
+          <w:p>
+            <w:r/>
+            <w:r>
+              <w:rPr>
+                <w:rFonts w:ascii="Arial" w:hAnsi="Arial"/>
+                <w:b w:val="0"/>
+                <w:color w:val="000000"/>
+                <w:sz w:val="22"/>
+              </w:rPr>
+              <w:t xml:space="preserve">  ✓  Google Ads</w:t>
+            </w:r>
+          </w:p>
+        </w:tc>
+      </w:tr>
+      <w:tr>
+        <w:tc>
+          <w:tcPr>
+            <w:tcW w:type="dxa" w:w="4873"/>
+            <w:shd w:val="clear" w:fill="FFFFFF"/>
+          </w:tcPr>
+          <w:p>
+            <w:r/>
+            <w:r>
+              <w:rPr>
+                <w:rFonts w:ascii="Arial" w:hAnsi="Arial"/>
+                <w:b w:val="0"/>
+                <w:color w:val="000000"/>
+                <w:sz w:val="22"/>
+              </w:rPr>
+              <w:t xml:space="preserve">  ✓  E-commerce Solutions</w:t>
+            </w:r>
+          </w:p>
+        </w:tc>
+        <w:tc>
+          <w:tcPr>
+            <w:tcW w:type="dxa" w:w="4873"/>
+            <w:shd w:val="clear" w:fill="FFFFFF"/>
+          </w:tcPr>
+          <w:p>
+            <w:r/>
+            <w:r>
+              <w:rPr>
+                <w:rFonts w:ascii="Arial" w:hAnsi="Arial"/>
+                <w:b w:val="0"/>
+                <w:color w:val="000000"/>
+                <w:sz w:val="22"/>
+              </w:rPr>
+              <w:t xml:space="preserve">  ✓  Meta Ads (Facebook &amp; Instagram)</w:t>
+            </w:r>
+          </w:p>
+        </w:tc>
+      </w:tr>
+      <w:tr>
+        <w:tc>
+          <w:tcPr>
+            <w:tcW w:type="dxa" w:w="4873"/>
+            <w:shd w:val="clear" w:fill="FFFFFF"/>
+          </w:tcPr>
+          <w:p>
+            <w:r/>
+            <w:r>
+              <w:rPr>
+                <w:rFonts w:ascii="Arial" w:hAnsi="Arial"/>
+                <w:b w:val="0"/>
+                <w:color w:val="000000"/>
+                <w:sz w:val="22"/>
+              </w:rPr>
+              <w:t xml:space="preserve">  ✓  Branding &amp; Visual Identity</w:t>
+            </w:r>
+          </w:p>
+        </w:tc>
+        <w:tc>
+          <w:tcPr>
+            <w:tcW w:type="dxa" w:w="4873"/>
+            <w:shd w:val="clear" w:fill="FFFFFF"/>
+          </w:tcPr>
+          <w:p>
+            <w:r/>
+            <w:r>
+              <w:rPr>
+                <w:rFonts w:ascii="Arial" w:hAnsi="Arial"/>
+                <w:b w:val="0"/>
+                <w:color w:val="000000"/>
+                <w:sz w:val="22"/>
+              </w:rPr>
+              <w:t xml:space="preserve">  ✓  Business Growth Strategy</w:t>
+            </w:r>
+          </w:p>
+        </w:tc>
+      </w:tr>
+      <w:tr>
+        <w:tc>
+          <w:tcPr>
+            <w:tcW w:type="dxa" w:w="4873"/>
+            <w:shd w:val="clear" w:fill="FFFFFF"/>
+          </w:tcPr>
+          <w:p>
+            <w:r/>
+            <w:r>
+              <w:rPr>
+                <w:rFonts w:ascii="Arial" w:hAnsi="Arial"/>
+                <w:b w:val="0"/>
+                <w:color w:val="000000"/>
+                <w:sz w:val="22"/>
+              </w:rPr>
+              <w:t xml:space="preserve">  ✓  Digital Marketing</w:t>
+            </w:r>
+          </w:p>
+        </w:tc>
+        <w:tc>
+          <w:tcPr>
+            <w:tcW w:type="dxa" w:w="4873"/>
+            <w:shd w:val="clear" w:fill="FFFFFF"/>
+          </w:tcPr>
+          <w:p>
+            <w:r/>
+          </w:p>
+        </w:tc>
+      </w:tr>
+    </w:tbl>
+    <w:p/>
+    <w:tbl>
+      <w:tblPr>
+        <w:tblW w:type="auto" w:w="0"/>
+        <w:tblLook w:firstColumn="1" w:firstRow="1" w:lastColumn="0" w:lastRow="0" w:noHBand="0" w:noVBand="1" w:val="04A0"/>
+      </w:tblPr>
+      <w:tblGrid>
+        <w:gridCol w:w="9746"/>
+      </w:tblGrid>
+      <w:tr>
+        <w:tc>
+          <w:tcPr>
+            <w:tcW w:type="dxa" w:w="9746"/>
+            <w:shd w:val="clear" w:fill="E8F7F9"/>
+          </w:tcPr>
+          <w:p>
+            <w:r>
+              <w:rPr>
+                <w:rFonts w:ascii="Arial" w:hAnsi="Arial"/>
+                <w:b/>
+                <w:color w:val="04243C"/>
+                <w:sz w:val="26"/>
+              </w:rPr>
+              <w:t>Why Choose CoLab Space Point</w:t>
+            </w:r>
+          </w:p>
+          <w:p>
+            <w:r>
+              <w:rPr>
+                <w:rFonts w:ascii="Arial" w:hAnsi="Arial"/>
+                <w:b w:val="0"/>
+                <w:color w:val="000000"/>
+                <w:sz w:val="22"/>
+              </w:rPr>
+              <w:t xml:space="preserve">  •  Experienced multidisciplinary team</w:t>
+            </w:r>
+          </w:p>
+          <w:p>
+            <w:r>
+              <w:rPr>
+                <w:rFonts w:ascii="Arial" w:hAnsi="Arial"/>
+                <w:b w:val="0"/>
+                <w:color w:val="000000"/>
+                <w:sz w:val="22"/>
+              </w:rPr>
+              <w:t xml:space="preserve">  •  Professional support and clear communication</w:t>
+            </w:r>
+          </w:p>
+          <w:p>
+            <w:r>
+              <w:rPr>
+                <w:rFonts w:ascii="Arial" w:hAnsi="Arial"/>
+                <w:b w:val="0"/>
+                <w:color w:val="000000"/>
+                <w:sz w:val="22"/>
+              </w:rPr>
+              <w:t xml:space="preserve">  •  Business-focused, results-driven solutions</w:t>
+            </w:r>
+          </w:p>
+          <w:p>
+            <w:r>
+              <w:rPr>
+                <w:rFonts w:ascii="Arial" w:hAnsi="Arial"/>
+                <w:b w:val="0"/>
+                <w:color w:val="000000"/>
+                <w:sz w:val="22"/>
+              </w:rPr>
+              <w:t xml:space="preserve">  •  Modern technology stack</w:t>
+            </w:r>
+          </w:p>
+          <w:p>
+            <w:r>
+              <w:rPr>
+                <w:rFonts w:ascii="Arial" w:hAnsi="Arial"/>
+                <w:b w:val="0"/>
+                <w:color w:val="000000"/>
+                <w:sz w:val="22"/>
+              </w:rPr>
+              <w:t xml:space="preserve">  •  Creative design and performance marketing</w:t>
+            </w:r>
+          </w:p>
+          <w:p>
+            <w:r>
+              <w:rPr>
+                <w:rFonts w:ascii="Arial" w:hAnsi="Arial"/>
+                <w:b w:val="0"/>
+                <w:color w:val="000000"/>
+                <w:sz w:val="22"/>
+              </w:rPr>
+              <w:t xml:space="preserve">  •  Transparent pricing and long-term partnership</w:t>
             </w:r>
           </w:p>
         </w:tc>
@@ -261,23 +805,9 @@
           <w:rFonts w:ascii="Arial" w:hAnsi="Arial"/>
           <w:b w:val="0"/>
           <w:color w:val="000000"/>
-          <w:sz w:val="24"/>
+          <w:sz w:val="22"/>
         </w:rPr>
-        <w:t>CoLab Space Point is the digital services arm of CoLab Point, Gujrat. We build websites, e-commerce stores, and run performance marketing campaigns.</w:t>
-      </w:r>
-    </w:p>
-    <w:p>
-      <w:pPr>
-        <w:spacing w:after="200" w:before="40"/>
-      </w:pPr>
-      <w:r>
-        <w:rPr>
-          <w:rFonts w:ascii="Arial" w:hAnsi="Arial"/>
-          <w:b w:val="0"/>
-          <w:color w:val="000000"/>
-          <w:sz w:val="24"/>
-        </w:rPr>
-        <w:t>WordPress is our primary development platform. Custom solutions are available on request.</w:t>
+        <w:t>WordPress is our primary development platform. Fully custom solutions are available on request.</w:t>
       </w:r>
     </w:p>
     <w:tbl>
@@ -315,7 +845,7 @@
                           <pic:cNvPicPr/>
                         </pic:nvPicPr>
                         <pic:blipFill>
-                          <a:blip r:embed="rId11"/>
+                          <a:blip r:embed="rId10"/>
                           <a:stretch>
                             <a:fillRect/>
                           </a:stretch>
@@ -394,7 +924,7 @@
                           <pic:cNvPicPr/>
                         </pic:nvPicPr>
                         <pic:blipFill>
-                          <a:blip r:embed="rId12"/>
+                          <a:blip r:embed="rId11"/>
                           <a:stretch>
                             <a:fillRect/>
                           </a:stretch>
@@ -680,7 +1210,7 @@
                           <pic:cNvPicPr/>
                         </pic:nvPicPr>
                         <pic:blipFill>
-                          <a:blip r:embed="rId13"/>
+                          <a:blip r:embed="rId12"/>
                           <a:stretch>
                             <a:fillRect/>
                           </a:stretch>
@@ -966,7 +1496,7 @@
                           <pic:cNvPicPr/>
                         </pic:nvPicPr>
                         <pic:blipFill>
-                          <a:blip r:embed="rId14"/>
+                          <a:blip r:embed="rId13"/>
                           <a:stretch>
                             <a:fillRect/>
                           </a:stretch>
@@ -1238,7 +1768,7 @@
                           <pic:cNvPicPr/>
                         </pic:nvPicPr>
                         <pic:blipFill>
-                          <a:blip r:embed="rId15"/>
+                          <a:blip r:embed="rId14"/>
                           <a:stretch>
                             <a:fillRect/>
                           </a:stretch>
@@ -1651,7 +2181,7 @@
                           <pic:cNvPicPr/>
                         </pic:nvPicPr>
                         <pic:blipFill>
-                          <a:blip r:embed="rId16"/>
+                          <a:blip r:embed="rId15"/>
                           <a:stretch>
                             <a:fillRect/>
                           </a:stretch>
@@ -1761,7 +2291,7 @@
       </w:r>
     </w:p>
     <w:sectPr>
-      <w:footerReference w:type="default" r:id="rId17"/>
+      <w:footerReference w:type="default" r:id="rId16"/>
       <w:pgSz w:w="12240" w:h="15840"/>
       <w:pgMar w:top="1134" w:right="1247" w:bottom="1134" w:left="1247" w:header="720" w:footer="720" w:gutter="0"/>
       <w:cols w:space="720"/>

</xml_diff>